<commit_message>
[0.0.8] - 2025-10-18 Completing PTZ Installed -- Ready for Startup
</commit_message>
<xml_diff>
--- a/PTZ/Operating_Notes.docx
+++ b/PTZ/Operating_Notes.docx
@@ -3,10 +3,370 @@
 <w:document xmlns:wpc="http://schemas.microsoft.com/office/word/2010/wordprocessingCanvas" xmlns:cx="http://schemas.microsoft.com/office/drawing/2014/chartex" xmlns:cx1="http://schemas.microsoft.com/office/drawing/2015/9/8/chartex" xmlns:cx2="http://schemas.microsoft.com/office/drawing/2015/10/21/chartex" xmlns:cx3="http://schemas.microsoft.com/office/drawing/2016/5/9/chartex" xmlns:cx4="http://schemas.microsoft.com/office/drawing/2016/5/10/chartex" xmlns:cx5="http://schemas.microsoft.com/office/drawing/2016/5/11/chartex" xmlns:cx6="http://schemas.microsoft.com/office/drawing/2016/5/12/chartex" xmlns:cx7="http://schemas.microsoft.com/office/drawing/2016/5/13/chartex" xmlns:cx8="http://schemas.microsoft.com/office/drawing/2016/5/14/chartex" xmlns:mc="http://schemas.openxmlformats.org/markup-compatibility/2006" xmlns:aink="http://schemas.microsoft.com/office/drawing/2016/ink" xmlns:am3d="http://schemas.microsoft.com/office/drawing/2017/model3d" xmlns:o="urn:schemas-microsoft-com:office:office" xmlns:oel="http://schemas.microsoft.com/office/2019/extlst" xmlns:r="http://schemas.openxmlformats.org/officeDocument/2006/relationships" xmlns:m="http://schemas.openxmlformats.org/officeDocument/2006/math" xmlns:v="urn:schemas-microsoft-com:vml" xmlns:wp14="http://schemas.microsoft.com/office/word/2010/wordprocessingDrawing" xmlns:wp="http://schemas.openxmlformats.org/drawingml/2006/wordprocessingDrawing" xmlns:w10="urn:schemas-microsoft-com:office:word" xmlns:w="http://schemas.openxmlformats.org/wordprocessingml/2006/main" xmlns:w14="http://schemas.microsoft.com/office/word/2010/wordml" xmlns:w15="http://schemas.microsoft.com/office/word/2012/wordml" xmlns:w16cex="http://schemas.microsoft.com/office/word/2018/wordml/cex" xmlns:w16cid="http://schemas.microsoft.com/office/word/2016/wordml/cid" xmlns:w16="http://schemas.microsoft.com/office/word/2018/wordml" xmlns:w16du="http://schemas.microsoft.com/office/word/2023/wordml/word16du" xmlns:w16sdtdh="http://schemas.microsoft.com/office/word/2020/wordml/sdtdatahash" xmlns:w16sdtfl="http://schemas.microsoft.com/office/word/2024/wordml/sdtformatlock" xmlns:w16se="http://schemas.microsoft.com/office/word/2015/wordml/symex" xmlns:wpg="http://schemas.microsoft.com/office/word/2010/wordprocessingGroup" xmlns:wpi="http://schemas.microsoft.com/office/word/2010/wordprocessingInk" xmlns:wne="http://schemas.microsoft.com/office/word/2006/wordml" xmlns:wps="http://schemas.microsoft.com/office/word/2010/wordprocessingShape" mc:Ignorable="w14 w15 w16se w16cid w16 w16cex w16sdtdh w16sdtfl w16du wp14">
   <w:body>
     <w:p>
-      <w:r>
-        <w:t>Operating Notes</w:t>
-      </w:r>
-    </w:p>
+      <w:pPr>
+        <w:jc w:val="center"/>
+        <w:rPr>
+          <w:b/>
+          <w:bCs/>
+          <w:sz w:val="52"/>
+          <w:szCs w:val="52"/>
+        </w:rPr>
+      </w:pPr>
+      <w:r>
+        <w:rPr>
+          <w:b/>
+          <w:bCs/>
+          <w:sz w:val="52"/>
+          <w:szCs w:val="52"/>
+        </w:rPr>
+        <w:t>Operating</w:t>
+      </w:r>
+      <w:r>
+        <w:rPr>
+          <w:b/>
+          <w:bCs/>
+          <w:sz w:val="52"/>
+          <w:szCs w:val="52"/>
+        </w:rPr>
+        <w:t xml:space="preserve"> Notes</w:t>
+      </w:r>
+    </w:p>
+    <w:p>
+      <w:pPr>
+        <w:spacing w:after="0" w:line="240" w:lineRule="auto"/>
+        <w:jc w:val="center"/>
+        <w:rPr>
+          <w:b/>
+          <w:bCs/>
+          <w:sz w:val="16"/>
+          <w:szCs w:val="16"/>
+        </w:rPr>
+      </w:pPr>
+      <w:r>
+        <w:rPr>
+          <w:b/>
+          <w:bCs/>
+          <w:sz w:val="16"/>
+          <w:szCs w:val="16"/>
+        </w:rPr>
+        <w:t xml:space="preserve">Rev. </w:t>
+      </w:r>
+      <w:r>
+        <w:rPr>
+          <w:b/>
+          <w:bCs/>
+          <w:sz w:val="16"/>
+          <w:szCs w:val="16"/>
+        </w:rPr>
+        <w:t>0</w:t>
+      </w:r>
+      <w:r>
+        <w:rPr>
+          <w:b/>
+          <w:bCs/>
+          <w:sz w:val="16"/>
+          <w:szCs w:val="16"/>
+        </w:rPr>
+        <w:t xml:space="preserve"> – 2025/10/</w:t>
+      </w:r>
+      <w:r>
+        <w:rPr>
+          <w:b/>
+          <w:bCs/>
+          <w:sz w:val="16"/>
+          <w:szCs w:val="16"/>
+        </w:rPr>
+        <w:t>18</w:t>
+      </w:r>
+      <w:r>
+        <w:rPr>
+          <w:b/>
+          <w:bCs/>
+          <w:sz w:val="16"/>
+          <w:szCs w:val="16"/>
+        </w:rPr>
+        <w:t xml:space="preserve"> – </w:t>
+      </w:r>
+      <w:r>
+        <w:rPr>
+          <w:b/>
+          <w:bCs/>
+          <w:sz w:val="16"/>
+          <w:szCs w:val="16"/>
+        </w:rPr>
+        <w:t>As Installed – Ready for live testing</w:t>
+      </w:r>
+    </w:p>
+    <w:p/>
+    <w:p/>
+    <w:p>
+      <w:pPr>
+        <w:rPr>
+          <w:b/>
+          <w:bCs/>
+          <w:u w:val="single"/>
+        </w:rPr>
+      </w:pPr>
+      <w:r>
+        <w:rPr>
+          <w:b/>
+          <w:bCs/>
+          <w:u w:val="single"/>
+        </w:rPr>
+        <w:t>Normal Operation</w:t>
+      </w:r>
+    </w:p>
+    <w:p>
+      <w:pPr>
+        <w:pStyle w:val="ListParagraph"/>
+        <w:numPr>
+          <w:ilvl w:val="0"/>
+          <w:numId w:val="2"/>
+        </w:numPr>
+      </w:pPr>
+      <w:r>
+        <w:t>Power on – Jim will normally do this well before you arrive.</w:t>
+      </w:r>
+    </w:p>
+    <w:p>
+      <w:pPr>
+        <w:pStyle w:val="ListParagraph"/>
+        <w:numPr>
+          <w:ilvl w:val="0"/>
+          <w:numId w:val="2"/>
+        </w:numPr>
+      </w:pPr>
+      <w:r>
+        <w:t>Wait a while</w:t>
+      </w:r>
+    </w:p>
+    <w:p>
+      <w:pPr>
+        <w:pStyle w:val="ListParagraph"/>
+        <w:numPr>
+          <w:ilvl w:val="1"/>
+          <w:numId w:val="2"/>
+        </w:numPr>
+      </w:pPr>
+      <w:r>
+        <w:t>Jim’s early power on will normally accomplish this</w:t>
+      </w:r>
+    </w:p>
+    <w:p>
+      <w:pPr>
+        <w:pStyle w:val="ListParagraph"/>
+        <w:numPr>
+          <w:ilvl w:val="1"/>
+          <w:numId w:val="2"/>
+        </w:numPr>
+      </w:pPr>
+      <w:r>
+        <w:t xml:space="preserve">Good discipline to </w:t>
+      </w:r>
+      <w:r>
+        <w:t>ensure</w:t>
+      </w:r>
+      <w:r>
+        <w:t xml:space="preserve"> waiting:</w:t>
+      </w:r>
+    </w:p>
+    <w:p>
+      <w:pPr>
+        <w:pStyle w:val="ListParagraph"/>
+        <w:numPr>
+          <w:ilvl w:val="2"/>
+          <w:numId w:val="2"/>
+        </w:numPr>
+      </w:pPr>
+      <w:r>
+        <w:t xml:space="preserve">Power up and connect tripod cameras 1 &amp; </w:t>
+      </w:r>
+      <w:r>
+        <w:t>2</w:t>
+      </w:r>
+    </w:p>
+    <w:p>
+      <w:pPr>
+        <w:pStyle w:val="ListParagraph"/>
+        <w:numPr>
+          <w:ilvl w:val="2"/>
+          <w:numId w:val="2"/>
+        </w:numPr>
+      </w:pPr>
+      <w:r>
+        <w:t xml:space="preserve">Power up computer and </w:t>
+      </w:r>
+      <w:r>
+        <w:t>set up</w:t>
+      </w:r>
+      <w:r>
+        <w:t xml:space="preserve"> stream</w:t>
+      </w:r>
+    </w:p>
+    <w:p>
+      <w:pPr>
+        <w:pStyle w:val="ListParagraph"/>
+        <w:numPr>
+          <w:ilvl w:val="0"/>
+          <w:numId w:val="2"/>
+        </w:numPr>
+      </w:pPr>
+      <w:r>
+        <w:t>Select Camera 3 and make sure it connects</w:t>
+      </w:r>
+    </w:p>
+    <w:p>
+      <w:pPr>
+        <w:pStyle w:val="ListParagraph"/>
+        <w:numPr>
+          <w:ilvl w:val="0"/>
+          <w:numId w:val="2"/>
+        </w:numPr>
+      </w:pPr>
+      <w:r>
+        <w:t>Select Camera 4 and make sure it connects</w:t>
+      </w:r>
+    </w:p>
+    <w:p>
+      <w:pPr>
+        <w:pStyle w:val="ListParagraph"/>
+        <w:numPr>
+          <w:ilvl w:val="0"/>
+          <w:numId w:val="2"/>
+        </w:numPr>
+      </w:pPr>
+      <w:r>
+        <w:t>Press the PVW button</w:t>
+      </w:r>
+      <w:r>
+        <w:t xml:space="preserve"> and mak</w:t>
+      </w:r>
+      <w:r>
+        <w:t xml:space="preserve">e </w:t>
+      </w:r>
+      <w:r>
+        <w:t xml:space="preserve">sure video connects on both Cameras 3 and </w:t>
+      </w:r>
+      <w:r>
+        <w:t>4</w:t>
+      </w:r>
+    </w:p>
+    <w:p>
+      <w:pPr>
+        <w:pStyle w:val="ListParagraph"/>
+        <w:numPr>
+          <w:ilvl w:val="0"/>
+          <w:numId w:val="2"/>
+        </w:numPr>
+      </w:pPr>
+      <w:r>
+        <w:t>Confirm Pan, Tilt, and Zoom control on Camera 3</w:t>
+      </w:r>
+    </w:p>
+    <w:p>
+      <w:pPr>
+        <w:pStyle w:val="ListParagraph"/>
+        <w:numPr>
+          <w:ilvl w:val="0"/>
+          <w:numId w:val="2"/>
+        </w:numPr>
+      </w:pPr>
+      <w:r>
+        <w:t xml:space="preserve">Confirm Pan, Tilt, and Zoom control on Camera </w:t>
+      </w:r>
+      <w:r>
+        <w:t>4</w:t>
+      </w:r>
+    </w:p>
+    <w:p>
+      <w:pPr>
+        <w:pStyle w:val="ListParagraph"/>
+        <w:numPr>
+          <w:ilvl w:val="0"/>
+          <w:numId w:val="2"/>
+        </w:numPr>
+      </w:pPr>
+      <w:r>
+        <w:t>Review</w:t>
+      </w:r>
+      <w:r>
+        <w:t xml:space="preserve"> Presets and revise as needed.</w:t>
+      </w:r>
+    </w:p>
+    <w:p>
+      <w:pPr>
+        <w:pStyle w:val="ListParagraph"/>
+        <w:numPr>
+          <w:ilvl w:val="0"/>
+          <w:numId w:val="2"/>
+        </w:numPr>
+      </w:pPr>
+      <w:r>
+        <w:t xml:space="preserve">Confirm </w:t>
+      </w:r>
+      <w:r>
+        <w:t>Switcher Connectivity and Function on all 4 cameras</w:t>
+      </w:r>
+    </w:p>
+    <w:p/>
+    <w:p>
+      <w:pPr>
+        <w:rPr>
+          <w:b/>
+          <w:bCs/>
+          <w:u w:val="single"/>
+        </w:rPr>
+      </w:pPr>
+      <w:r>
+        <w:rPr>
+          <w:b/>
+          <w:bCs/>
+          <w:u w:val="single"/>
+        </w:rPr>
+        <w:t>Troubleshooting</w:t>
+      </w:r>
+    </w:p>
+    <w:p>
+      <w:pPr>
+        <w:pStyle w:val="ListParagraph"/>
+        <w:numPr>
+          <w:ilvl w:val="0"/>
+          <w:numId w:val="1"/>
+        </w:numPr>
+      </w:pPr>
+      <w:r>
+        <w:t>Check all for power.</w:t>
+      </w:r>
+    </w:p>
+    <w:p>
+      <w:pPr>
+        <w:pStyle w:val="ListParagraph"/>
+        <w:numPr>
+          <w:ilvl w:val="0"/>
+          <w:numId w:val="1"/>
+        </w:numPr>
+      </w:pPr>
+      <w:r>
+        <w:t>Cycle Power and Wait</w:t>
+      </w:r>
+    </w:p>
+    <w:p>
+      <w:pPr>
+        <w:pStyle w:val="ListParagraph"/>
+        <w:numPr>
+          <w:ilvl w:val="0"/>
+          <w:numId w:val="1"/>
+        </w:numPr>
+      </w:pPr>
+      <w:r>
+        <w:t>Reconfigure Cameras as shown on configuration notes</w:t>
+      </w:r>
+      <w:r>
+        <w:t>.  Don’t panic if the IP addresses change.  Changes should be rare, but they are technically DYNAMIC.</w:t>
+      </w:r>
+    </w:p>
+    <w:p/>
+    <w:p/>
     <w:p/>
     <w:sectPr>
       <w:pgSz w:w="12240" w:h="15840"/>
@@ -16,6 +376,195 @@
     </w:sectPr>
   </w:body>
 </w:document>
+</file>
+
+<file path=word/numbering.xml><?xml version="1.0" encoding="utf-8"?>
+<w:numbering xmlns:wpc="http://schemas.microsoft.com/office/word/2010/wordprocessingCanvas" xmlns:cx="http://schemas.microsoft.com/office/drawing/2014/chartex" xmlns:cx1="http://schemas.microsoft.com/office/drawing/2015/9/8/chartex" xmlns:cx2="http://schemas.microsoft.com/office/drawing/2015/10/21/chartex" xmlns:cx3="http://schemas.microsoft.com/office/drawing/2016/5/9/chartex" xmlns:cx4="http://schemas.microsoft.com/office/drawing/2016/5/10/chartex" xmlns:cx5="http://schemas.microsoft.com/office/drawing/2016/5/11/chartex" xmlns:cx6="http://schemas.microsoft.com/office/drawing/2016/5/12/chartex" xmlns:cx7="http://schemas.microsoft.com/office/drawing/2016/5/13/chartex" xmlns:cx8="http://schemas.microsoft.com/office/drawing/2016/5/14/chartex" xmlns:mc="http://schemas.openxmlformats.org/markup-compatibility/2006" xmlns:aink="http://schemas.microsoft.com/office/drawing/2016/ink" xmlns:am3d="http://schemas.microsoft.com/office/drawing/2017/model3d" xmlns:o="urn:schemas-microsoft-com:office:office" xmlns:oel="http://schemas.microsoft.com/office/2019/extlst" xmlns:r="http://schemas.openxmlformats.org/officeDocument/2006/relationships" xmlns:m="http://schemas.openxmlformats.org/officeDocument/2006/math" xmlns:v="urn:schemas-microsoft-com:vml" xmlns:wp14="http://schemas.microsoft.com/office/word/2010/wordprocessingDrawing" xmlns:wp="http://schemas.openxmlformats.org/drawingml/2006/wordprocessingDrawing" xmlns:w10="urn:schemas-microsoft-com:office:word" xmlns:w="http://schemas.openxmlformats.org/wordprocessingml/2006/main" xmlns:w14="http://schemas.microsoft.com/office/word/2010/wordml" xmlns:w15="http://schemas.microsoft.com/office/word/2012/wordml" xmlns:w16cex="http://schemas.microsoft.com/office/word/2018/wordml/cex" xmlns:w16cid="http://schemas.microsoft.com/office/word/2016/wordml/cid" xmlns:w16="http://schemas.microsoft.com/office/word/2018/wordml" xmlns:w16du="http://schemas.microsoft.com/office/word/2023/wordml/word16du" xmlns:w16sdtdh="http://schemas.microsoft.com/office/word/2020/wordml/sdtdatahash" xmlns:w16sdtfl="http://schemas.microsoft.com/office/word/2024/wordml/sdtformatlock" xmlns:w16se="http://schemas.microsoft.com/office/word/2015/wordml/symex" xmlns:wpg="http://schemas.microsoft.com/office/word/2010/wordprocessingGroup" xmlns:wpi="http://schemas.microsoft.com/office/word/2010/wordprocessingInk" xmlns:wne="http://schemas.microsoft.com/office/word/2006/wordml" xmlns:wps="http://schemas.microsoft.com/office/word/2010/wordprocessingShape" mc:Ignorable="w14 w15 w16se w16cid w16 w16cex w16sdtdh w16sdtfl w16du wp14">
+  <w:abstractNum w:abstractNumId="0" w15:restartNumberingAfterBreak="0">
+    <w:nsid w:val="69BF1C7E"/>
+    <w:multiLevelType w:val="hybridMultilevel"/>
+    <w:tmpl w:val="1E867B62"/>
+    <w:lvl w:ilvl="0" w:tplc="0409000F">
+      <w:start w:val="1"/>
+      <w:numFmt w:val="decimal"/>
+      <w:lvlText w:val="%1."/>
+      <w:lvlJc w:val="left"/>
+      <w:pPr>
+        <w:ind w:left="720" w:hanging="360"/>
+      </w:pPr>
+      <w:rPr>
+        <w:rFonts w:hint="default"/>
+      </w:rPr>
+    </w:lvl>
+    <w:lvl w:ilvl="1" w:tplc="04090019" w:tentative="1">
+      <w:start w:val="1"/>
+      <w:numFmt w:val="lowerLetter"/>
+      <w:lvlText w:val="%2."/>
+      <w:lvlJc w:val="left"/>
+      <w:pPr>
+        <w:ind w:left="1440" w:hanging="360"/>
+      </w:pPr>
+    </w:lvl>
+    <w:lvl w:ilvl="2" w:tplc="0409001B" w:tentative="1">
+      <w:start w:val="1"/>
+      <w:numFmt w:val="lowerRoman"/>
+      <w:lvlText w:val="%3."/>
+      <w:lvlJc w:val="right"/>
+      <w:pPr>
+        <w:ind w:left="2160" w:hanging="180"/>
+      </w:pPr>
+    </w:lvl>
+    <w:lvl w:ilvl="3" w:tplc="0409000F" w:tentative="1">
+      <w:start w:val="1"/>
+      <w:numFmt w:val="decimal"/>
+      <w:lvlText w:val="%4."/>
+      <w:lvlJc w:val="left"/>
+      <w:pPr>
+        <w:ind w:left="2880" w:hanging="360"/>
+      </w:pPr>
+    </w:lvl>
+    <w:lvl w:ilvl="4" w:tplc="04090019" w:tentative="1">
+      <w:start w:val="1"/>
+      <w:numFmt w:val="lowerLetter"/>
+      <w:lvlText w:val="%5."/>
+      <w:lvlJc w:val="left"/>
+      <w:pPr>
+        <w:ind w:left="3600" w:hanging="360"/>
+      </w:pPr>
+    </w:lvl>
+    <w:lvl w:ilvl="5" w:tplc="0409001B" w:tentative="1">
+      <w:start w:val="1"/>
+      <w:numFmt w:val="lowerRoman"/>
+      <w:lvlText w:val="%6."/>
+      <w:lvlJc w:val="right"/>
+      <w:pPr>
+        <w:ind w:left="4320" w:hanging="180"/>
+      </w:pPr>
+    </w:lvl>
+    <w:lvl w:ilvl="6" w:tplc="0409000F" w:tentative="1">
+      <w:start w:val="1"/>
+      <w:numFmt w:val="decimal"/>
+      <w:lvlText w:val="%7."/>
+      <w:lvlJc w:val="left"/>
+      <w:pPr>
+        <w:ind w:left="5040" w:hanging="360"/>
+      </w:pPr>
+    </w:lvl>
+    <w:lvl w:ilvl="7" w:tplc="04090019" w:tentative="1">
+      <w:start w:val="1"/>
+      <w:numFmt w:val="lowerLetter"/>
+      <w:lvlText w:val="%8."/>
+      <w:lvlJc w:val="left"/>
+      <w:pPr>
+        <w:ind w:left="5760" w:hanging="360"/>
+      </w:pPr>
+    </w:lvl>
+    <w:lvl w:ilvl="8" w:tplc="0409001B" w:tentative="1">
+      <w:start w:val="1"/>
+      <w:numFmt w:val="lowerRoman"/>
+      <w:lvlText w:val="%9."/>
+      <w:lvlJc w:val="right"/>
+      <w:pPr>
+        <w:ind w:left="6480" w:hanging="180"/>
+      </w:pPr>
+    </w:lvl>
+  </w:abstractNum>
+  <w:abstractNum w:abstractNumId="1" w15:restartNumberingAfterBreak="0">
+    <w:nsid w:val="6FA72D65"/>
+    <w:multiLevelType w:val="hybridMultilevel"/>
+    <w:tmpl w:val="A32E88D4"/>
+    <w:lvl w:ilvl="0" w:tplc="0409000F">
+      <w:start w:val="1"/>
+      <w:numFmt w:val="decimal"/>
+      <w:lvlText w:val="%1."/>
+      <w:lvlJc w:val="left"/>
+      <w:pPr>
+        <w:ind w:left="720" w:hanging="360"/>
+      </w:pPr>
+      <w:rPr>
+        <w:rFonts w:hint="default"/>
+      </w:rPr>
+    </w:lvl>
+    <w:lvl w:ilvl="1" w:tplc="04090019">
+      <w:start w:val="1"/>
+      <w:numFmt w:val="lowerLetter"/>
+      <w:lvlText w:val="%2."/>
+      <w:lvlJc w:val="left"/>
+      <w:pPr>
+        <w:ind w:left="1440" w:hanging="360"/>
+      </w:pPr>
+    </w:lvl>
+    <w:lvl w:ilvl="2" w:tplc="0409001B">
+      <w:start w:val="1"/>
+      <w:numFmt w:val="lowerRoman"/>
+      <w:lvlText w:val="%3."/>
+      <w:lvlJc w:val="right"/>
+      <w:pPr>
+        <w:ind w:left="2160" w:hanging="180"/>
+      </w:pPr>
+    </w:lvl>
+    <w:lvl w:ilvl="3" w:tplc="0409000F" w:tentative="1">
+      <w:start w:val="1"/>
+      <w:numFmt w:val="decimal"/>
+      <w:lvlText w:val="%4."/>
+      <w:lvlJc w:val="left"/>
+      <w:pPr>
+        <w:ind w:left="2880" w:hanging="360"/>
+      </w:pPr>
+    </w:lvl>
+    <w:lvl w:ilvl="4" w:tplc="04090019" w:tentative="1">
+      <w:start w:val="1"/>
+      <w:numFmt w:val="lowerLetter"/>
+      <w:lvlText w:val="%5."/>
+      <w:lvlJc w:val="left"/>
+      <w:pPr>
+        <w:ind w:left="3600" w:hanging="360"/>
+      </w:pPr>
+    </w:lvl>
+    <w:lvl w:ilvl="5" w:tplc="0409001B" w:tentative="1">
+      <w:start w:val="1"/>
+      <w:numFmt w:val="lowerRoman"/>
+      <w:lvlText w:val="%6."/>
+      <w:lvlJc w:val="right"/>
+      <w:pPr>
+        <w:ind w:left="4320" w:hanging="180"/>
+      </w:pPr>
+    </w:lvl>
+    <w:lvl w:ilvl="6" w:tplc="0409000F" w:tentative="1">
+      <w:start w:val="1"/>
+      <w:numFmt w:val="decimal"/>
+      <w:lvlText w:val="%7."/>
+      <w:lvlJc w:val="left"/>
+      <w:pPr>
+        <w:ind w:left="5040" w:hanging="360"/>
+      </w:pPr>
+    </w:lvl>
+    <w:lvl w:ilvl="7" w:tplc="04090019" w:tentative="1">
+      <w:start w:val="1"/>
+      <w:numFmt w:val="lowerLetter"/>
+      <w:lvlText w:val="%8."/>
+      <w:lvlJc w:val="left"/>
+      <w:pPr>
+        <w:ind w:left="5760" w:hanging="360"/>
+      </w:pPr>
+    </w:lvl>
+    <w:lvl w:ilvl="8" w:tplc="0409001B" w:tentative="1">
+      <w:start w:val="1"/>
+      <w:numFmt w:val="lowerRoman"/>
+      <w:lvlText w:val="%9."/>
+      <w:lvlJc w:val="right"/>
+      <w:pPr>
+        <w:ind w:left="6480" w:hanging="180"/>
+      </w:pPr>
+    </w:lvl>
+  </w:abstractNum>
+  <w:num w:numId="1" w16cid:durableId="1363819690">
+    <w:abstractNumId w:val="0"/>
+  </w:num>
+  <w:num w:numId="2" w16cid:durableId="370813392">
+    <w:abstractNumId w:val="1"/>
+  </w:num>
+</w:numbering>
 </file>
 
 <file path=word/styles.xml><?xml version="1.0" encoding="utf-8"?>

</xml_diff>

<commit_message>
[0.1.2] - 2025-10-24 Added remote camera exposure, color, and focus control
</commit_message>
<xml_diff>
--- a/PTZ/Operating_Notes.docx
+++ b/PTZ/Operating_Notes.docx
@@ -29,6 +29,29 @@
           <w:szCs w:val="52"/>
         </w:rPr>
         <w:t xml:space="preserve"> Notes</w:t>
+      </w:r>
+    </w:p>
+    <w:p>
+      <w:pPr>
+        <w:spacing w:after="0" w:line="240" w:lineRule="auto"/>
+        <w:jc w:val="center"/>
+        <w:rPr>
+          <w:i/>
+          <w:iCs/>
+          <w:strike/>
+          <w:sz w:val="12"/>
+          <w:szCs w:val="12"/>
+        </w:rPr>
+      </w:pPr>
+      <w:r>
+        <w:rPr>
+          <w:i/>
+          <w:iCs/>
+          <w:strike/>
+          <w:sz w:val="12"/>
+          <w:szCs w:val="12"/>
+        </w:rPr>
+        <w:t>Rev. 0 – 2025/10/18 – As Installed – Ready for live testing</w:t>
       </w:r>
     </w:p>
     <w:p>
@@ -58,7 +81,7 @@
           <w:sz w:val="16"/>
           <w:szCs w:val="16"/>
         </w:rPr>
-        <w:t>0</w:t>
+        <w:t>1</w:t>
       </w:r>
       <w:r>
         <w:rPr>
@@ -76,7 +99,7 @@
           <w:sz w:val="16"/>
           <w:szCs w:val="16"/>
         </w:rPr>
-        <w:t>18</w:t>
+        <w:t>24</w:t>
       </w:r>
       <w:r>
         <w:rPr>
@@ -94,8 +117,20 @@
           <w:sz w:val="16"/>
           <w:szCs w:val="16"/>
         </w:rPr>
-        <w:t>As Installed – Ready for live testing</w:t>
-      </w:r>
+        <w:t>Camera Control Updates</w:t>
+      </w:r>
+    </w:p>
+    <w:p>
+      <w:pPr>
+        <w:spacing w:after="0" w:line="240" w:lineRule="auto"/>
+        <w:jc w:val="center"/>
+        <w:rPr>
+          <w:b/>
+          <w:bCs/>
+          <w:sz w:val="16"/>
+          <w:szCs w:val="16"/>
+        </w:rPr>
+      </w:pPr>
     </w:p>
     <w:p/>
     <w:p/>
@@ -245,7 +280,15 @@
         <w:t xml:space="preserve">e </w:t>
       </w:r>
       <w:r>
-        <w:t xml:space="preserve">sure video connects on both Cameras 3 and </w:t>
+        <w:t xml:space="preserve">sure video connects </w:t>
+      </w:r>
+      <w:proofErr w:type="gramStart"/>
+      <w:r>
+        <w:t>on</w:t>
+      </w:r>
+      <w:proofErr w:type="gramEnd"/>
+      <w:r>
+        <w:t xml:space="preserve"> both Cameras 3 and </w:t>
       </w:r>
       <w:r>
         <w:t>4</w:t>
@@ -272,10 +315,7 @@
         </w:numPr>
       </w:pPr>
       <w:r>
-        <w:t xml:space="preserve">Confirm Pan, Tilt, and Zoom control on Camera </w:t>
-      </w:r>
-      <w:r>
-        <w:t>4</w:t>
+        <w:t>Confirm Pan, Tilt, and Zoom control on Camera 4</w:t>
       </w:r>
     </w:p>
     <w:p>
@@ -362,7 +402,7 @@
         <w:t>Reconfigure Cameras as shown on configuration notes</w:t>
       </w:r>
       <w:r>
-        <w:t>.  Don’t panic if the IP addresses change.  Changes should be rare, but they are technically DYNAMIC.</w:t>
+        <w:t xml:space="preserve">.  </w:t>
       </w:r>
     </w:p>
     <w:p/>

</xml_diff>